<commit_message>
Shrink demo guide title to 22pt so it fits on one line
</commit_message>
<xml_diff>
--- a/Viz-QWIM/src/dashboard/shiny_tab_goal_parity/assets/QWIM_Dashboard_Demo_Guide.docx
+++ b/Viz-QWIM/src/dashboard/shiny_tab_goal_parity/assets/QWIM_Dashboard_Demo_Guide.docx
@@ -7,6 +7,9 @@
         <w:pStyle w:val="Title"/>
       </w:pPr>
       <w:r>
+        <w:rPr>
+          <w:sz w:val="44"/>
+        </w:rPr>
         <w:t>QWIM Dashboard — Demo &amp; User Guide</w:t>
       </w:r>
     </w:p>
@@ -519,7 +522,7 @@
       <w:r>
         <w:drawing>
           <wp:inline xmlns:a="http://schemas.openxmlformats.org/drawingml/2006/main" xmlns:pic="http://schemas.openxmlformats.org/drawingml/2006/picture">
-            <wp:extent cx="5760720" cy="1632204"/>
+            <wp:extent cx="5760720" cy="1820228"/>
             <wp:docPr id="9" name="Picture 9"/>
             <wp:cNvGraphicFramePr>
               <a:graphicFrameLocks noChangeAspect="1"/>
@@ -540,7 +543,7 @@
                   <pic:spPr>
                     <a:xfrm>
                       <a:off x="0" y="0"/>
-                      <a:ext cx="5760720" cy="1632204"/>
+                      <a:ext cx="5760720" cy="1820228"/>
                     </a:xfrm>
                     <a:prstGeom prst="rect"/>
                   </pic:spPr>

</xml_diff>

<commit_message>
Expand demo guide with detailed per-page client instructions
Each Goal Parity section now carries a 'How to use this page' list —
what to set, how to read the outputs, what to check before moving on,
with nested sub-bullets — plus a 'Common mistakes to avoid' section
mirroring the dashboard guide page.
</commit_message>
<xml_diff>
--- a/Viz-QWIM/src/dashboard/shiny_tab_goal_parity/assets/QWIM_Dashboard_Demo_Guide.docx
+++ b/Viz-QWIM/src/dashboard/shiny_tab_goal_parity/assets/QWIM_Dashboard_Demo_Guide.docx
@@ -443,7 +443,7 @@
     </w:p>
     <w:p>
       <w:r>
-        <w:t>The landing page: why goal-based investing holds up across market regimes, and the step-by-step usage guide. Partners can download this document from the button here.</w:t>
+        <w:t>The landing page: why goal-based investing holds up across market regimes, and the step-by-step usage guide. This document can be downloaded from the button here.</w:t>
       </w:r>
     </w:p>
     <w:p>
@@ -565,6 +565,38 @@
       </w:r>
     </w:p>
     <w:p>
+      <w:r>
+        <w:rPr>
+          <w:b/>
+        </w:rPr>
+        <w:t>How to use this page:</w:t>
+      </w:r>
+    </w:p>
+    <w:p>
+      <w:pPr>
+        <w:pStyle w:val="ListBullet"/>
+      </w:pPr>
+      <w:r>
+        <w:t>Read the five advantage cards first — they are the 'why' behind everything that follows.</w:t>
+      </w:r>
+    </w:p>
+    <w:p>
+      <w:pPr>
+        <w:pStyle w:val="ListBullet"/>
+      </w:pPr>
+      <w:r>
+        <w:t>The numbered stepper below them mirrors the subtabs to the right; use it as your checklist while working through them.</w:t>
+      </w:r>
+    </w:p>
+    <w:p>
+      <w:pPr>
+        <w:pStyle w:val="ListBullet"/>
+      </w:pPr>
+      <w:r>
+        <w:t>Skim the amber 'Common mistakes' box before starting — it covers the errors that most often lead to misleading results.</w:t>
+      </w:r>
+    </w:p>
+    <w:p>
       <w:pPr>
         <w:pStyle w:val="Heading2"/>
       </w:pPr>
@@ -574,7 +606,7 @@
     </w:p>
     <w:p>
       <w:r>
-        <w:t>Step 1 — the client's risk comfort and horizon become the model's risk-aversion and loss barrier. Point out the 'Source:' line showing inputs flow in from the Clients tab.</w:t>
+        <w:t>Step 1 — tell the model who you are. The client's risk comfort and time horizon become the model's risk-aversion parameter and personal loss barrier.</w:t>
       </w:r>
     </w:p>
     <w:p>
@@ -624,6 +656,78 @@
       </w:r>
     </w:p>
     <w:p>
+      <w:r>
+        <w:rPr>
+          <w:b/>
+        </w:rPr>
+        <w:t>How to use this page:</w:t>
+      </w:r>
+    </w:p>
+    <w:p>
+      <w:pPr>
+        <w:pStyle w:val="ListBullet"/>
+      </w:pPr>
+      <w:r>
+        <w:t>If your advisor has filled in the Clients tab, leave 'Use Clients tab inputs' checked — your horizon and risk profile flow in automatically; nothing else to do.</w:t>
+      </w:r>
+    </w:p>
+    <w:p>
+      <w:pPr>
+        <w:pStyle w:val="ListBullet"/>
+      </w:pPr>
+      <w:r>
+        <w:t>Otherwise, uncheck the box and set three sidebar inputs:</w:t>
+      </w:r>
+    </w:p>
+    <w:p>
+      <w:pPr>
+        <w:pStyle w:val="ListBullet2"/>
+      </w:pPr>
+      <w:r>
+        <w:t>Risk profile — from Conservative to Aggressive; when unsure, start with Moderate.</w:t>
+      </w:r>
+    </w:p>
+    <w:p>
+      <w:pPr>
+        <w:pStyle w:val="ListBullet2"/>
+      </w:pPr>
+      <w:r>
+        <w:t>Strategic horizon T — years until the money is needed (e.g. years to retirement). Use the real timeline: a too-short horizon makes the portfolio overly cautious.</w:t>
+      </w:r>
+    </w:p>
+    <w:p>
+      <w:pPr>
+        <w:pStyle w:val="ListBullet2"/>
+      </w:pPr>
+      <w:r>
+        <w:t>Rebalancing frequency τ — how often the portfolio is reviewed. Semi-annual is the recommended default.</w:t>
+      </w:r>
+    </w:p>
+    <w:p>
+      <w:pPr>
+        <w:pStyle w:val="ListBullet"/>
+      </w:pPr>
+      <w:r>
+        <w:t>Before moving on, check two things on the right:</w:t>
+      </w:r>
+    </w:p>
+    <w:p>
+      <w:pPr>
+        <w:pStyle w:val="ListBullet2"/>
+      </w:pPr>
+      <w:r>
+        <w:t>The table's 'loss tolerance' row — the decline you could accept before changing course. If it feels wrong, adjust the risk profile.</w:t>
+      </w:r>
+    </w:p>
+    <w:p>
+      <w:pPr>
+        <w:pStyle w:val="ListBullet2"/>
+      </w:pPr>
+      <w:r>
+        <w:t>The 'Source:' line — it says whether inputs came from the Clients tab or the sidebar. If it says Clients tab but that tab is empty or stale, uncheck the box and enter values manually.</w:t>
+      </w:r>
+    </w:p>
+    <w:p>
       <w:pPr>
         <w:pStyle w:val="Heading2"/>
       </w:pPr>
@@ -633,7 +737,7 @@
     </w:p>
     <w:p>
       <w:r>
-        <w:t>Steps 2–4 — every asset is scored on how it actually behaves toward each goal (option-style triggers, not static labels). The scatter places each asset between the four goal corners.</w:t>
+        <w:t>Steps 2–4 — choose what the model can invest in. Every asset is scored on how it actually behaves toward each goal (option-style triggers, not static labels), and the scatter places each asset between the four goal corners.</w:t>
       </w:r>
     </w:p>
     <w:p>
@@ -683,6 +787,38 @@
       </w:r>
     </w:p>
     <w:p>
+      <w:r>
+        <w:rPr>
+          <w:b/>
+        </w:rPr>
+        <w:t>How to use this page:</w:t>
+      </w:r>
+    </w:p>
+    <w:p>
+      <w:pPr>
+        <w:pStyle w:val="ListBullet"/>
+      </w:pPr>
+      <w:r>
+        <w:t>Tick the checkboxes for the investments to consider; keeping the full default list selected is a good starting point.</w:t>
+      </w:r>
+    </w:p>
+    <w:p>
+      <w:pPr>
+        <w:pStyle w:val="ListBullet"/>
+      </w:pPr>
+      <w:r>
+        <w:t>One asset can serve several goals at once (e.g. part Income, part Preservation) — hover the scatter points to see each asset's split.</w:t>
+      </w:r>
+    </w:p>
+    <w:p>
+      <w:pPr>
+        <w:pStyle w:val="ListBullet"/>
+      </w:pPr>
+      <w:r>
+        <w:t>Keep the universe broad: every goal needs at least a few supporting assets. If a later step flags a goal as 'structurally scarce', return here and re-add tickers rather than fighting the optimizer.</w:t>
+      </w:r>
+    </w:p>
+    <w:p>
       <w:pPr>
         <w:pStyle w:val="Heading2"/>
       </w:pPr>
@@ -692,7 +828,7 @@
     </w:p>
     <w:p>
       <w:r>
-        <w:t>Step 5 — the optimizer balances the four goal powers (default: 25% each) or applies a deliberate tilt. Show the weights and goal-power bars; note the warnings the page surfaces when something needs advisor judgement.</w:t>
+        <w:t>Step 5 — build the target portfolio. The optimizer balances the four goal powers (default: 25% each) or applies a deliberate tilt toward one goal.</w:t>
       </w:r>
     </w:p>
     <w:p>
@@ -742,6 +878,70 @@
       </w:r>
     </w:p>
     <w:p>
+      <w:r>
+        <w:rPr>
+          <w:b/>
+        </w:rPr>
+        <w:t>How to use this page:</w:t>
+      </w:r>
+    </w:p>
+    <w:p>
+      <w:pPr>
+        <w:pStyle w:val="ListBullet"/>
+      </w:pPr>
+      <w:r>
+        <w:t>Start with Goal Parity Balanced (the default) — for most clients this is the recommended portfolio.</w:t>
+      </w:r>
+    </w:p>
+    <w:p>
+      <w:pPr>
+        <w:pStyle w:val="ListBullet"/>
+      </w:pPr>
+      <w:r>
+        <w:t>Choose Goal Tilted only to deliberately favor one goal (more Growth for a young saver, more Income near retirement):</w:t>
+      </w:r>
+    </w:p>
+    <w:p>
+      <w:pPr>
+        <w:pStyle w:val="ListBullet2"/>
+      </w:pPr>
+      <w:r>
+        <w:t>Pick the goal, then set the tilt-strength slider — small tilts (10–30%) are usually enough.</w:t>
+      </w:r>
+    </w:p>
+    <w:p>
+      <w:pPr>
+        <w:pStyle w:val="ListBullet2"/>
+      </w:pPr>
+      <w:r>
+        <w:t>A tilt shifts priorities between goals; it is NOT a 'more return' dial. Maximum tilt concentrates the portfolio and gives up diversification.</w:t>
+      </w:r>
+    </w:p>
+    <w:p>
+      <w:pPr>
+        <w:pStyle w:val="ListBullet"/>
+      </w:pPr>
+      <w:r>
+        <w:t>Read any warning banners before trusting the numbers:</w:t>
+      </w:r>
+    </w:p>
+    <w:p>
+      <w:pPr>
+        <w:pStyle w:val="ListBullet2"/>
+      </w:pPr>
+      <w:r>
+        <w:t>'Solver failure' — the shown weights are a best effort; confirm with your advisor before acting.</w:t>
+      </w:r>
+    </w:p>
+    <w:p>
+      <w:pPr>
+        <w:pStyle w:val="ListBullet2"/>
+      </w:pPr>
+      <w:r>
+        <w:t>'Structurally scarce goal' — the chosen investments cannot support that goal much further; fix it in Step 2, not here.</w:t>
+      </w:r>
+    </w:p>
+    <w:p>
       <w:pPr>
         <w:pStyle w:val="Heading2"/>
       </w:pPr>
@@ -751,7 +951,7 @@
     </w:p>
     <w:p>
       <w:r>
-        <w:t>Step 6 — a simulated market drift and the cost-aware trades that restore the goal balance. Emphasize the turnover budget: the model will not churn the portfolio.</w:t>
+        <w:t>Step 6 — see how the portfolio stays on track. This page is a simulation: markets drift the portfolio away from its targets, and the model shows the cost-aware trades that restore the goal balance.</w:t>
       </w:r>
     </w:p>
     <w:p>
@@ -801,6 +1001,62 @@
       </w:r>
     </w:p>
     <w:p>
+      <w:r>
+        <w:rPr>
+          <w:b/>
+        </w:rPr>
+        <w:t>How to use this page:</w:t>
+      </w:r>
+    </w:p>
+    <w:p>
+      <w:pPr>
+        <w:pStyle w:val="ListBullet"/>
+      </w:pPr>
+      <w:r>
+        <w:t>Two controls: the σ slider sets how large the simulated market move is; the seed picks which random scenario is shown.</w:t>
+      </w:r>
+    </w:p>
+    <w:p>
+      <w:pPr>
+        <w:pStyle w:val="ListBullet"/>
+      </w:pPr>
+      <w:r>
+        <w:t>Read the results top to bottom:</w:t>
+      </w:r>
+    </w:p>
+    <w:p>
+      <w:pPr>
+        <w:pStyle w:val="ListBullet2"/>
+      </w:pPr>
+      <w:r>
+        <w:t>The summary line — number of trades and portfolio turnover (capped by design: the model will not churn everything).</w:t>
+      </w:r>
+    </w:p>
+    <w:p>
+      <w:pPr>
+        <w:pStyle w:val="ListBullet2"/>
+      </w:pPr>
+      <w:r>
+        <w:t>The bar chart — goal support drifted → after rebalance → target; bars should move back toward the target.</w:t>
+      </w:r>
+    </w:p>
+    <w:p>
+      <w:pPr>
+        <w:pStyle w:val="ListBullet2"/>
+      </w:pPr>
+      <w:r>
+        <w:t>The trade table — each row is one sell/buy pair, ranked so the most goal-restoring, lowest-cost trades come first.</w:t>
+      </w:r>
+    </w:p>
+    <w:p>
+      <w:pPr>
+        <w:pStyle w:val="ListBullet"/>
+      </w:pPr>
+      <w:r>
+        <w:t>Different seeds give different trades — that is expected: each seed is a different market scenario, not a different answer to the same question.</w:t>
+      </w:r>
+    </w:p>
+    <w:p>
       <w:pPr>
         <w:pStyle w:val="Heading2"/>
       </w:pPr>
@@ -810,7 +1066,7 @@
     </w:p>
     <w:p>
       <w:r>
-        <w:t>The evidence: a walk-forward replay with no look-ahead — the model is re-trained on past data only at every step. The user chooses the date range, training window, test window, and step size, then runs it live.</w:t>
+        <w:t>The evidence — a walk-forward replay with no look-ahead: the model is re-trained on past data only at every step, its portfolio is held for one step, and realized results accumulate next to a classic 60/40 benchmark.</w:t>
       </w:r>
     </w:p>
     <w:p>
@@ -857,6 +1113,142 @@
           <w:sz w:val="18"/>
         </w:rPr>
         <w:t>Goal Parity — Historical Backtest.</w:t>
+      </w:r>
+    </w:p>
+    <w:p>
+      <w:r>
+        <w:rPr>
+          <w:b/>
+        </w:rPr>
+        <w:t>How to use this page:</w:t>
+      </w:r>
+    </w:p>
+    <w:p>
+      <w:pPr>
+        <w:pStyle w:val="ListBullet"/>
+      </w:pPr>
+      <w:r>
+        <w:t>Four sidebar settings (the defaults are sensible — start there):</w:t>
+      </w:r>
+    </w:p>
+    <w:p>
+      <w:pPr>
+        <w:pStyle w:val="ListBullet2"/>
+      </w:pPr>
+      <w:r>
+        <w:t>Backtest date range — which slice of history to replay.</w:t>
+      </w:r>
+    </w:p>
+    <w:p>
+      <w:pPr>
+        <w:pStyle w:val="ListBullet2"/>
+      </w:pPr>
+      <w:r>
+        <w:t>Training window — years of past data the model learns from at each step; keep it at 2.5 years or more, shorter windows trigger a noise warning.</w:t>
+      </w:r>
+    </w:p>
+    <w:p>
+      <w:pPr>
+        <w:pStyle w:val="ListBullet2"/>
+      </w:pPr>
+      <w:r>
+        <w:t>Test window — the horizon each fold's performance is measured over in the fold table.</w:t>
+      </w:r>
+    </w:p>
+    <w:p>
+      <w:pPr>
+        <w:pStyle w:val="ListBullet2"/>
+      </w:pPr>
+      <w:r>
+        <w:t>Step size — how often the model re-trains and rebalances; leave it equal to the review frequency τ unless there is a reason not to.</w:t>
+      </w:r>
+    </w:p>
+    <w:p>
+      <w:pPr>
+        <w:pStyle w:val="ListBullet"/>
+      </w:pPr>
+      <w:r>
+        <w:t>Click 'Run backtest' and read the results top to bottom:</w:t>
+      </w:r>
+    </w:p>
+    <w:p>
+      <w:pPr>
+        <w:pStyle w:val="ListBullet2"/>
+      </w:pPr>
+      <w:r>
+        <w:t>The chart — growth of $1 for the model vs. the benchmark; dotted vertical lines mark re-training dates.</w:t>
+      </w:r>
+    </w:p>
+    <w:p>
+      <w:pPr>
+        <w:pStyle w:val="ListBullet2"/>
+      </w:pPr>
+      <w:r>
+        <w:t>The metrics table — return, volatility, Sharpe ratio, and max drawdown side by side.</w:t>
+      </w:r>
+    </w:p>
+    <w:p>
+      <w:pPr>
+        <w:pStyle w:val="ListBullet2"/>
+      </w:pPr>
+      <w:r>
+        <w:t>The fold table — per-period results, showing when the model helped (stress periods) and when it lagged (strong bull runs).</w:t>
+      </w:r>
+    </w:p>
+    <w:p>
+      <w:pPr>
+        <w:pStyle w:val="ListBullet"/>
+      </w:pPr>
+      <w:r>
+        <w:t>A red message means the configuration is impossible (e.g. the date range is too short for the training window) — shrink the training window or widen the dates.</w:t>
+      </w:r>
+    </w:p>
+    <w:p>
+      <w:pPr>
+        <w:pStyle w:val="Heading2"/>
+      </w:pPr>
+      <w:r>
+        <w:t>Common mistakes to avoid</w:t>
+      </w:r>
+    </w:p>
+    <w:p>
+      <w:pPr>
+        <w:pStyle w:val="ListBullet"/>
+      </w:pPr>
+      <w:r>
+        <w:t>Jumping straight to Optimization or Rebalancing — the results then reflect the default Moderate profile, not the client's.</w:t>
+      </w:r>
+    </w:p>
+    <w:p>
+      <w:pPr>
+        <w:pStyle w:val="ListBullet"/>
+      </w:pPr>
+      <w:r>
+        <w:t>Leaving 'Use Clients tab inputs' checked when the Clients tab is empty or stale — always check the 'Source:' line in Step 1.</w:t>
+      </w:r>
+    </w:p>
+    <w:p>
+      <w:pPr>
+        <w:pStyle w:val="ListBullet"/>
+      </w:pPr>
+      <w:r>
+        <w:t>Setting a horizon shorter than the client's actual timeline, which understates how much Growth the plan can safely carry.</w:t>
+      </w:r>
+    </w:p>
+    <w:p>
+      <w:pPr>
+        <w:pStyle w:val="ListBullet"/>
+      </w:pPr>
+      <w:r>
+        <w:t>Ignoring the solver-failure or scarce-goal warnings in Step 3 — they qualify every number shown downstream.</w:t>
+      </w:r>
+    </w:p>
+    <w:p>
+      <w:pPr>
+        <w:pStyle w:val="ListBullet"/>
+      </w:pPr>
+      <w:r>
+        <w:t>Comparing rebalancing trades across different drift seeds and concluding the model is unstable — each seed is a different scenario.</w:t>
       </w:r>
     </w:p>
     <w:p>

</xml_diff>